<commit_message>
feat(member-6): complete Knowledge Graph (NetworkX), Air-Gap Sentinel certificate generator, and FastAPI REST router with 34 passing tests
</commit_message>
<xml_diff>
--- a/MRPL_Executive_Approval_Note.docx
+++ b/MRPL_Executive_Approval_Note.docx
@@ -360,7 +360,7 @@
                 <w:color w:val="334155"/>
                 <w:sz w:val="20"/>
               </w:rPr>
-              <w:t>Thermographic and vibration telemetry in CDU-1 indicates critical drive-end bearing degradation (7.8 mm/s RMS vs 4.5 mm/s limit) on Main Crude Charge Pump P-102A. Immediate sanction is requested to overhaul the unit during the scheduled turnaround.</w:t>
+              <w:t>Thermographic and vibration telemetry in CDU-1 indicates critical drive-end bearing degradation (7.8 mm/s RMS vs 4.5 mm/s limit) on Main Crude Charge Pump P-102A. Immediate sanction is requested to overhaul the unit while transferring feed load to standby pump P-102B.</w:t>
             </w:r>
           </w:p>
         </w:tc>
@@ -961,7 +961,7 @@
         <w:spacing w:after="320"/>
       </w:pPr>
       <w:r>
-        <w:t>Approval requested for immediate mobilization of OEM spares (SKF 23144 CC/W33) and mechanical overhaul.</w:t>
+        <w:t>Approval requested for immediate mobilization of OEM spares (SKF 23144 CC/W33) and mechanical overhaul under SOP-CDU-SEC-014.</w:t>
       </w:r>
     </w:p>
     <w:tbl>

</xml_diff>